<commit_message>
ABNT: citacoes no estilo da NBR 10520:2023 (inicial maiuscula), DOCX e PDF atualizados
Co-Authored-By: Claude Sonnet 5.5 <noreply@anthropic.com>
</commit_message>
<xml_diff>
--- a/redacao/abnt/saida/Raphael_Eiras-Decomposicao_por_aspecto_do_sentimento_em_avaliacoes_do_airbnb_rj-ucp_2026-ABNT.docx
+++ b/redacao/abnt/saida/Raphael_Eiras-Decomposicao_por_aspecto_do_sentimento_em_avaliacoes_do_airbnb_rj-ucp_2026-ABNT.docx
@@ -391,7 +391,7 @@
       <w:r>
         <w:fldChar w:fldCharType="separate"/>
       </w:r>
-      <w:hyperlink w:anchor="_Toc242737826" w:history="1">
+      <w:hyperlink w:anchor="_Toc242739045" w:history="1">
         <w:r>
           <w:rPr>
             <w:rStyle w:val="Hyperlink"/>
@@ -418,7 +418,7 @@
             <w:noProof/>
             <w:webHidden/>
           </w:rPr>
-          <w:instrText xml:space="preserve"> PAGEREF _Toc242737826 \h </w:instrText>
+          <w:instrText xml:space="preserve"> PAGEREF _Toc242739045 \h </w:instrText>
         </w:r>
         <w:r>
           <w:rPr>
@@ -464,7 +464,7 @@
           <w14:ligatures w14:val="standardContextual"/>
         </w:rPr>
       </w:pPr>
-      <w:hyperlink w:anchor="_Toc242737827" w:history="1">
+      <w:hyperlink w:anchor="_Toc242739046" w:history="1">
         <w:r>
           <w:rPr>
             <w:rStyle w:val="Hyperlink"/>
@@ -491,7 +491,7 @@
             <w:noProof/>
             <w:webHidden/>
           </w:rPr>
-          <w:instrText xml:space="preserve"> PAGEREF _Toc242737827 \h </w:instrText>
+          <w:instrText xml:space="preserve"> PAGEREF _Toc242739046 \h </w:instrText>
         </w:r>
         <w:r>
           <w:rPr>
@@ -537,7 +537,7 @@
           <w14:ligatures w14:val="standardContextual"/>
         </w:rPr>
       </w:pPr>
-      <w:hyperlink w:anchor="_Toc242737828" w:history="1">
+      <w:hyperlink w:anchor="_Toc242739047" w:history="1">
         <w:r>
           <w:rPr>
             <w:rStyle w:val="Hyperlink"/>
@@ -564,7 +564,7 @@
             <w:noProof/>
             <w:webHidden/>
           </w:rPr>
-          <w:instrText xml:space="preserve"> PAGEREF _Toc242737828 \h </w:instrText>
+          <w:instrText xml:space="preserve"> PAGEREF _Toc242739047 \h </w:instrText>
         </w:r>
         <w:r>
           <w:rPr>
@@ -610,7 +610,7 @@
           <w14:ligatures w14:val="standardContextual"/>
         </w:rPr>
       </w:pPr>
-      <w:hyperlink w:anchor="_Toc242737829" w:history="1">
+      <w:hyperlink w:anchor="_Toc242739048" w:history="1">
         <w:r>
           <w:rPr>
             <w:rStyle w:val="Hyperlink"/>
@@ -637,7 +637,7 @@
             <w:noProof/>
             <w:webHidden/>
           </w:rPr>
-          <w:instrText xml:space="preserve"> PAGEREF _Toc242737829 \h </w:instrText>
+          <w:instrText xml:space="preserve"> PAGEREF _Toc242739048 \h </w:instrText>
         </w:r>
         <w:r>
           <w:rPr>
@@ -683,7 +683,7 @@
           <w14:ligatures w14:val="standardContextual"/>
         </w:rPr>
       </w:pPr>
-      <w:hyperlink w:anchor="_Toc242737830" w:history="1">
+      <w:hyperlink w:anchor="_Toc242739049" w:history="1">
         <w:r>
           <w:rPr>
             <w:rStyle w:val="Hyperlink"/>
@@ -733,7 +733,7 @@
             <w:noProof/>
             <w:webHidden/>
           </w:rPr>
-          <w:instrText xml:space="preserve"> PAGEREF _Toc242737830 \h </w:instrText>
+          <w:instrText xml:space="preserve"> PAGEREF _Toc242739049 \h </w:instrText>
         </w:r>
         <w:r>
           <w:rPr>
@@ -779,7 +779,7 @@
           <w14:ligatures w14:val="standardContextual"/>
         </w:rPr>
       </w:pPr>
-      <w:hyperlink w:anchor="_Toc242737831" w:history="1">
+      <w:hyperlink w:anchor="_Toc242739050" w:history="1">
         <w:r>
           <w:rPr>
             <w:rStyle w:val="Hyperlink"/>
@@ -806,7 +806,7 @@
             <w:noProof/>
             <w:webHidden/>
           </w:rPr>
-          <w:instrText xml:space="preserve"> PAGEREF _Toc242737831 \h </w:instrText>
+          <w:instrText xml:space="preserve"> PAGEREF _Toc242739050 \h </w:instrText>
         </w:r>
         <w:r>
           <w:rPr>
@@ -852,7 +852,7 @@
           <w14:ligatures w14:val="standardContextual"/>
         </w:rPr>
       </w:pPr>
-      <w:hyperlink w:anchor="_Toc242737832" w:history="1">
+      <w:hyperlink w:anchor="_Toc242739051" w:history="1">
         <w:r>
           <w:rPr>
             <w:rStyle w:val="Hyperlink"/>
@@ -902,7 +902,7 @@
             <w:noProof/>
             <w:webHidden/>
           </w:rPr>
-          <w:instrText xml:space="preserve"> PAGEREF _Toc242737832 \h </w:instrText>
+          <w:instrText xml:space="preserve"> PAGEREF _Toc242739051 \h </w:instrText>
         </w:r>
         <w:r>
           <w:rPr>
@@ -948,7 +948,7 @@
           <w14:ligatures w14:val="standardContextual"/>
         </w:rPr>
       </w:pPr>
-      <w:hyperlink w:anchor="_Toc242737833" w:history="1">
+      <w:hyperlink w:anchor="_Toc242739052" w:history="1">
         <w:r>
           <w:rPr>
             <w:rStyle w:val="Hyperlink"/>
@@ -975,7 +975,7 @@
             <w:noProof/>
             <w:webHidden/>
           </w:rPr>
-          <w:instrText xml:space="preserve"> PAGEREF _Toc242737833 \h </w:instrText>
+          <w:instrText xml:space="preserve"> PAGEREF _Toc242739052 \h </w:instrText>
         </w:r>
         <w:r>
           <w:rPr>
@@ -1021,7 +1021,7 @@
           <w14:ligatures w14:val="standardContextual"/>
         </w:rPr>
       </w:pPr>
-      <w:hyperlink w:anchor="_Toc242737834" w:history="1">
+      <w:hyperlink w:anchor="_Toc242739053" w:history="1">
         <w:r>
           <w:rPr>
             <w:rStyle w:val="Hyperlink"/>
@@ -1048,7 +1048,7 @@
             <w:noProof/>
             <w:webHidden/>
           </w:rPr>
-          <w:instrText xml:space="preserve"> PAGEREF _Toc242737834 \h </w:instrText>
+          <w:instrText xml:space="preserve"> PAGEREF _Toc242739053 \h </w:instrText>
         </w:r>
         <w:r>
           <w:rPr>
@@ -1094,7 +1094,7 @@
           <w14:ligatures w14:val="standardContextual"/>
         </w:rPr>
       </w:pPr>
-      <w:hyperlink w:anchor="_Toc242737835" w:history="1">
+      <w:hyperlink w:anchor="_Toc242739054" w:history="1">
         <w:r>
           <w:rPr>
             <w:rStyle w:val="Hyperlink"/>
@@ -1121,7 +1121,7 @@
             <w:noProof/>
             <w:webHidden/>
           </w:rPr>
-          <w:instrText xml:space="preserve"> PAGEREF _Toc242737835 \h </w:instrText>
+          <w:instrText xml:space="preserve"> PAGEREF _Toc242739054 \h </w:instrText>
         </w:r>
         <w:r>
           <w:rPr>
@@ -1167,7 +1167,7 @@
           <w14:ligatures w14:val="standardContextual"/>
         </w:rPr>
       </w:pPr>
-      <w:hyperlink w:anchor="_Toc242737836" w:history="1">
+      <w:hyperlink w:anchor="_Toc242739055" w:history="1">
         <w:r>
           <w:rPr>
             <w:rStyle w:val="Hyperlink"/>
@@ -1194,7 +1194,7 @@
             <w:noProof/>
             <w:webHidden/>
           </w:rPr>
-          <w:instrText xml:space="preserve"> PAGEREF _Toc242737836 \h </w:instrText>
+          <w:instrText xml:space="preserve"> PAGEREF _Toc242739055 \h </w:instrText>
         </w:r>
         <w:r>
           <w:rPr>
@@ -1240,7 +1240,7 @@
           <w14:ligatures w14:val="standardContextual"/>
         </w:rPr>
       </w:pPr>
-      <w:hyperlink w:anchor="_Toc242737837" w:history="1">
+      <w:hyperlink w:anchor="_Toc242739056" w:history="1">
         <w:r>
           <w:rPr>
             <w:rStyle w:val="Hyperlink"/>
@@ -1290,7 +1290,7 @@
             <w:noProof/>
             <w:webHidden/>
           </w:rPr>
-          <w:instrText xml:space="preserve"> PAGEREF _Toc242737837 \h </w:instrText>
+          <w:instrText xml:space="preserve"> PAGEREF _Toc242739056 \h </w:instrText>
         </w:r>
         <w:r>
           <w:rPr>
@@ -1336,7 +1336,7 @@
           <w14:ligatures w14:val="standardContextual"/>
         </w:rPr>
       </w:pPr>
-      <w:hyperlink w:anchor="_Toc242737838" w:history="1">
+      <w:hyperlink w:anchor="_Toc242739057" w:history="1">
         <w:r>
           <w:rPr>
             <w:rStyle w:val="Hyperlink"/>
@@ -1363,7 +1363,7 @@
             <w:noProof/>
             <w:webHidden/>
           </w:rPr>
-          <w:instrText xml:space="preserve"> PAGEREF _Toc242737838 \h </w:instrText>
+          <w:instrText xml:space="preserve"> PAGEREF _Toc242739057 \h </w:instrText>
         </w:r>
         <w:r>
           <w:rPr>
@@ -1441,7 +1441,7 @@
       <w:r>
         <w:fldChar w:fldCharType="separate"/>
       </w:r>
-      <w:hyperlink w:anchor="_Toc242737786" w:history="1">
+      <w:hyperlink w:anchor="_Toc242739005" w:history="1">
         <w:r>
           <w:rPr>
             <w:rStyle w:val="Hyperlink"/>
@@ -1468,7 +1468,7 @@
             <w:noProof/>
             <w:webHidden/>
           </w:rPr>
-          <w:instrText xml:space="preserve"> PAGEREF _Toc242737786 \h </w:instrText>
+          <w:instrText xml:space="preserve"> PAGEREF _Toc242739005 \h </w:instrText>
         </w:r>
         <w:r>
           <w:rPr>
@@ -1514,7 +1514,7 @@
           <w14:ligatures w14:val="standardContextual"/>
         </w:rPr>
       </w:pPr>
-      <w:hyperlink w:anchor="_Toc242737787" w:history="1">
+      <w:hyperlink w:anchor="_Toc242739006" w:history="1">
         <w:r>
           <w:rPr>
             <w:rStyle w:val="Hyperlink"/>
@@ -1541,7 +1541,7 @@
             <w:noProof/>
             <w:webHidden/>
           </w:rPr>
-          <w:instrText xml:space="preserve"> PAGEREF _Toc242737787 \h </w:instrText>
+          <w:instrText xml:space="preserve"> PAGEREF _Toc242739006 \h </w:instrText>
         </w:r>
         <w:r>
           <w:rPr>
@@ -1587,7 +1587,7 @@
           <w14:ligatures w14:val="standardContextual"/>
         </w:rPr>
       </w:pPr>
-      <w:hyperlink w:anchor="_Toc242737788" w:history="1">
+      <w:hyperlink w:anchor="_Toc242739007" w:history="1">
         <w:r>
           <w:rPr>
             <w:rStyle w:val="Hyperlink"/>
@@ -1614,7 +1614,7 @@
             <w:noProof/>
             <w:webHidden/>
           </w:rPr>
-          <w:instrText xml:space="preserve"> PAGEREF _Toc242737788 \h </w:instrText>
+          <w:instrText xml:space="preserve"> PAGEREF _Toc242739007 \h </w:instrText>
         </w:r>
         <w:r>
           <w:rPr>
@@ -1660,7 +1660,7 @@
           <w14:ligatures w14:val="standardContextual"/>
         </w:rPr>
       </w:pPr>
-      <w:hyperlink w:anchor="_Toc242737789" w:history="1">
+      <w:hyperlink w:anchor="_Toc242739008" w:history="1">
         <w:r>
           <w:rPr>
             <w:rStyle w:val="Hyperlink"/>
@@ -1687,7 +1687,7 @@
             <w:noProof/>
             <w:webHidden/>
           </w:rPr>
-          <w:instrText xml:space="preserve"> PAGEREF _Toc242737789 \h </w:instrText>
+          <w:instrText xml:space="preserve"> PAGEREF _Toc242739008 \h </w:instrText>
         </w:r>
         <w:r>
           <w:rPr>
@@ -1733,7 +1733,7 @@
           <w14:ligatures w14:val="standardContextual"/>
         </w:rPr>
       </w:pPr>
-      <w:hyperlink w:anchor="_Toc242737790" w:history="1">
+      <w:hyperlink w:anchor="_Toc242739009" w:history="1">
         <w:r>
           <w:rPr>
             <w:rStyle w:val="Hyperlink"/>
@@ -1760,7 +1760,7 @@
             <w:noProof/>
             <w:webHidden/>
           </w:rPr>
-          <w:instrText xml:space="preserve"> PAGEREF _Toc242737790 \h </w:instrText>
+          <w:instrText xml:space="preserve"> PAGEREF _Toc242739009 \h </w:instrText>
         </w:r>
         <w:r>
           <w:rPr>
@@ -1806,7 +1806,7 @@
           <w14:ligatures w14:val="standardContextual"/>
         </w:rPr>
       </w:pPr>
-      <w:hyperlink w:anchor="_Toc242737791" w:history="1">
+      <w:hyperlink w:anchor="_Toc242739010" w:history="1">
         <w:r>
           <w:rPr>
             <w:rStyle w:val="Hyperlink"/>
@@ -1833,7 +1833,7 @@
             <w:noProof/>
             <w:webHidden/>
           </w:rPr>
-          <w:instrText xml:space="preserve"> PAGEREF _Toc242737791 \h </w:instrText>
+          <w:instrText xml:space="preserve"> PAGEREF _Toc242739010 \h </w:instrText>
         </w:r>
         <w:r>
           <w:rPr>
@@ -1879,7 +1879,7 @@
           <w14:ligatures w14:val="standardContextual"/>
         </w:rPr>
       </w:pPr>
-      <w:hyperlink w:anchor="_Toc242737792" w:history="1">
+      <w:hyperlink w:anchor="_Toc242739011" w:history="1">
         <w:r>
           <w:rPr>
             <w:rStyle w:val="Hyperlink"/>
@@ -1906,7 +1906,7 @@
             <w:noProof/>
             <w:webHidden/>
           </w:rPr>
-          <w:instrText xml:space="preserve"> PAGEREF _Toc242737792 \h </w:instrText>
+          <w:instrText xml:space="preserve"> PAGEREF _Toc242739011 \h </w:instrText>
         </w:r>
         <w:r>
           <w:rPr>
@@ -1952,7 +1952,7 @@
           <w14:ligatures w14:val="standardContextual"/>
         </w:rPr>
       </w:pPr>
-      <w:hyperlink w:anchor="_Toc242737793" w:history="1">
+      <w:hyperlink w:anchor="_Toc242739012" w:history="1">
         <w:r>
           <w:rPr>
             <w:rStyle w:val="Hyperlink"/>
@@ -1979,7 +1979,7 @@
             <w:noProof/>
             <w:webHidden/>
           </w:rPr>
-          <w:instrText xml:space="preserve"> PAGEREF _Toc242737793 \h </w:instrText>
+          <w:instrText xml:space="preserve"> PAGEREF _Toc242739012 \h </w:instrText>
         </w:r>
         <w:r>
           <w:rPr>
@@ -2025,7 +2025,7 @@
           <w14:ligatures w14:val="standardContextual"/>
         </w:rPr>
       </w:pPr>
-      <w:hyperlink w:anchor="_Toc242737794" w:history="1">
+      <w:hyperlink w:anchor="_Toc242739013" w:history="1">
         <w:r>
           <w:rPr>
             <w:rStyle w:val="Hyperlink"/>
@@ -2052,7 +2052,7 @@
             <w:noProof/>
             <w:webHidden/>
           </w:rPr>
-          <w:instrText xml:space="preserve"> PAGEREF _Toc242737794 \h </w:instrText>
+          <w:instrText xml:space="preserve"> PAGEREF _Toc242739013 \h </w:instrText>
         </w:r>
         <w:r>
           <w:rPr>
@@ -2072,7 +2072,7 @@
             <w:noProof/>
             <w:webHidden/>
           </w:rPr>
-          <w:t>14</w:t>
+          <w:t>13</w:t>
         </w:r>
         <w:r>
           <w:rPr>
@@ -2098,7 +2098,7 @@
           <w14:ligatures w14:val="standardContextual"/>
         </w:rPr>
       </w:pPr>
-      <w:hyperlink w:anchor="_Toc242737795" w:history="1">
+      <w:hyperlink w:anchor="_Toc242739014" w:history="1">
         <w:r>
           <w:rPr>
             <w:rStyle w:val="Hyperlink"/>
@@ -2125,7 +2125,7 @@
             <w:noProof/>
             <w:webHidden/>
           </w:rPr>
-          <w:instrText xml:space="preserve"> PAGEREF _Toc242737795 \h </w:instrText>
+          <w:instrText xml:space="preserve"> PAGEREF _Toc242739014 \h </w:instrText>
         </w:r>
         <w:r>
           <w:rPr>
@@ -2171,7 +2171,7 @@
           <w14:ligatures w14:val="standardContextual"/>
         </w:rPr>
       </w:pPr>
-      <w:hyperlink w:anchor="_Toc242737796" w:history="1">
+      <w:hyperlink w:anchor="_Toc242739015" w:history="1">
         <w:r>
           <w:rPr>
             <w:rStyle w:val="Hyperlink"/>
@@ -2198,7 +2198,7 @@
             <w:noProof/>
             <w:webHidden/>
           </w:rPr>
-          <w:instrText xml:space="preserve"> PAGEREF _Toc242737796 \h </w:instrText>
+          <w:instrText xml:space="preserve"> PAGEREF _Toc242739015 \h </w:instrText>
         </w:r>
         <w:r>
           <w:rPr>
@@ -2244,7 +2244,7 @@
           <w14:ligatures w14:val="standardContextual"/>
         </w:rPr>
       </w:pPr>
-      <w:hyperlink w:anchor="_Toc242737797" w:history="1">
+      <w:hyperlink w:anchor="_Toc242739016" w:history="1">
         <w:r>
           <w:rPr>
             <w:rStyle w:val="Hyperlink"/>
@@ -2271,7 +2271,7 @@
             <w:noProof/>
             <w:webHidden/>
           </w:rPr>
-          <w:instrText xml:space="preserve"> PAGEREF _Toc242737797 \h </w:instrText>
+          <w:instrText xml:space="preserve"> PAGEREF _Toc242739016 \h </w:instrText>
         </w:r>
         <w:r>
           <w:rPr>
@@ -2317,7 +2317,7 @@
           <w14:ligatures w14:val="standardContextual"/>
         </w:rPr>
       </w:pPr>
-      <w:hyperlink w:anchor="_Toc242737798" w:history="1">
+      <w:hyperlink w:anchor="_Toc242739017" w:history="1">
         <w:r>
           <w:rPr>
             <w:rStyle w:val="Hyperlink"/>
@@ -2344,7 +2344,7 @@
             <w:noProof/>
             <w:webHidden/>
           </w:rPr>
-          <w:instrText xml:space="preserve"> PAGEREF _Toc242737798 \h </w:instrText>
+          <w:instrText xml:space="preserve"> PAGEREF _Toc242739017 \h </w:instrText>
         </w:r>
         <w:r>
           <w:rPr>
@@ -2390,7 +2390,7 @@
           <w14:ligatures w14:val="standardContextual"/>
         </w:rPr>
       </w:pPr>
-      <w:hyperlink w:anchor="_Toc242737799" w:history="1">
+      <w:hyperlink w:anchor="_Toc242739018" w:history="1">
         <w:r>
           <w:rPr>
             <w:rStyle w:val="Hyperlink"/>
@@ -2417,7 +2417,7 @@
             <w:noProof/>
             <w:webHidden/>
           </w:rPr>
-          <w:instrText xml:space="preserve"> PAGEREF _Toc242737799 \h </w:instrText>
+          <w:instrText xml:space="preserve"> PAGEREF _Toc242739018 \h </w:instrText>
         </w:r>
         <w:r>
           <w:rPr>
@@ -2463,7 +2463,7 @@
           <w14:ligatures w14:val="standardContextual"/>
         </w:rPr>
       </w:pPr>
-      <w:hyperlink w:anchor="_Toc242737800" w:history="1">
+      <w:hyperlink w:anchor="_Toc242739019" w:history="1">
         <w:r>
           <w:rPr>
             <w:rStyle w:val="Hyperlink"/>
@@ -2490,7 +2490,7 @@
             <w:noProof/>
             <w:webHidden/>
           </w:rPr>
-          <w:instrText xml:space="preserve"> PAGEREF _Toc242737800 \h </w:instrText>
+          <w:instrText xml:space="preserve"> PAGEREF _Toc242739019 \h </w:instrText>
         </w:r>
         <w:r>
           <w:rPr>
@@ -2536,7 +2536,7 @@
           <w14:ligatures w14:val="standardContextual"/>
         </w:rPr>
       </w:pPr>
-      <w:hyperlink w:anchor="_Toc242737801" w:history="1">
+      <w:hyperlink w:anchor="_Toc242739020" w:history="1">
         <w:r>
           <w:rPr>
             <w:rStyle w:val="Hyperlink"/>
@@ -2563,7 +2563,7 @@
             <w:noProof/>
             <w:webHidden/>
           </w:rPr>
-          <w:instrText xml:space="preserve"> PAGEREF _Toc242737801 \h </w:instrText>
+          <w:instrText xml:space="preserve"> PAGEREF _Toc242739020 \h </w:instrText>
         </w:r>
         <w:r>
           <w:rPr>
@@ -2609,7 +2609,7 @@
           <w14:ligatures w14:val="standardContextual"/>
         </w:rPr>
       </w:pPr>
-      <w:hyperlink w:anchor="_Toc242737802" w:history="1">
+      <w:hyperlink w:anchor="_Toc242739021" w:history="1">
         <w:r>
           <w:rPr>
             <w:rStyle w:val="Hyperlink"/>
@@ -2636,7 +2636,7 @@
             <w:noProof/>
             <w:webHidden/>
           </w:rPr>
-          <w:instrText xml:space="preserve"> PAGEREF _Toc242737802 \h </w:instrText>
+          <w:instrText xml:space="preserve"> PAGEREF _Toc242739021 \h </w:instrText>
         </w:r>
         <w:r>
           <w:rPr>
@@ -2682,7 +2682,7 @@
           <w14:ligatures w14:val="standardContextual"/>
         </w:rPr>
       </w:pPr>
-      <w:hyperlink w:anchor="_Toc242737803" w:history="1">
+      <w:hyperlink w:anchor="_Toc242739022" w:history="1">
         <w:r>
           <w:rPr>
             <w:rStyle w:val="Hyperlink"/>
@@ -2709,7 +2709,7 @@
             <w:noProof/>
             <w:webHidden/>
           </w:rPr>
-          <w:instrText xml:space="preserve"> PAGEREF _Toc242737803 \h </w:instrText>
+          <w:instrText xml:space="preserve"> PAGEREF _Toc242739022 \h </w:instrText>
         </w:r>
         <w:r>
           <w:rPr>
@@ -2755,7 +2755,7 @@
           <w14:ligatures w14:val="standardContextual"/>
         </w:rPr>
       </w:pPr>
-      <w:hyperlink w:anchor="_Toc242737804" w:history="1">
+      <w:hyperlink w:anchor="_Toc242739023" w:history="1">
         <w:r>
           <w:rPr>
             <w:rStyle w:val="Hyperlink"/>
@@ -2782,7 +2782,7 @@
             <w:noProof/>
             <w:webHidden/>
           </w:rPr>
-          <w:instrText xml:space="preserve"> PAGEREF _Toc242737804 \h </w:instrText>
+          <w:instrText xml:space="preserve"> PAGEREF _Toc242739023 \h </w:instrText>
         </w:r>
         <w:r>
           <w:rPr>
@@ -2828,7 +2828,7 @@
           <w14:ligatures w14:val="standardContextual"/>
         </w:rPr>
       </w:pPr>
-      <w:hyperlink w:anchor="_Toc242737805" w:history="1">
+      <w:hyperlink w:anchor="_Toc242739024" w:history="1">
         <w:r>
           <w:rPr>
             <w:rStyle w:val="Hyperlink"/>
@@ -2855,7 +2855,7 @@
             <w:noProof/>
             <w:webHidden/>
           </w:rPr>
-          <w:instrText xml:space="preserve"> PAGEREF _Toc242737805 \h </w:instrText>
+          <w:instrText xml:space="preserve"> PAGEREF _Toc242739024 \h </w:instrText>
         </w:r>
         <w:r>
           <w:rPr>
@@ -2901,7 +2901,7 @@
           <w14:ligatures w14:val="standardContextual"/>
         </w:rPr>
       </w:pPr>
-      <w:hyperlink w:anchor="_Toc242737806" w:history="1">
+      <w:hyperlink w:anchor="_Toc242739025" w:history="1">
         <w:r>
           <w:rPr>
             <w:rStyle w:val="Hyperlink"/>
@@ -2928,7 +2928,7 @@
             <w:noProof/>
             <w:webHidden/>
           </w:rPr>
-          <w:instrText xml:space="preserve"> PAGEREF _Toc242737806 \h </w:instrText>
+          <w:instrText xml:space="preserve"> PAGEREF _Toc242739025 \h </w:instrText>
         </w:r>
         <w:r>
           <w:rPr>
@@ -2974,7 +2974,7 @@
           <w14:ligatures w14:val="standardContextual"/>
         </w:rPr>
       </w:pPr>
-      <w:hyperlink w:anchor="_Toc242737807" w:history="1">
+      <w:hyperlink w:anchor="_Toc242739026" w:history="1">
         <w:r>
           <w:rPr>
             <w:rStyle w:val="Hyperlink"/>
@@ -3001,7 +3001,7 @@
             <w:noProof/>
             <w:webHidden/>
           </w:rPr>
-          <w:instrText xml:space="preserve"> PAGEREF _Toc242737807 \h </w:instrText>
+          <w:instrText xml:space="preserve"> PAGEREF _Toc242739026 \h </w:instrText>
         </w:r>
         <w:r>
           <w:rPr>
@@ -3047,7 +3047,7 @@
           <w14:ligatures w14:val="standardContextual"/>
         </w:rPr>
       </w:pPr>
-      <w:hyperlink w:anchor="_Toc242737808" w:history="1">
+      <w:hyperlink w:anchor="_Toc242739027" w:history="1">
         <w:r>
           <w:rPr>
             <w:rStyle w:val="Hyperlink"/>
@@ -3074,7 +3074,7 @@
             <w:noProof/>
             <w:webHidden/>
           </w:rPr>
-          <w:instrText xml:space="preserve"> PAGEREF _Toc242737808 \h </w:instrText>
+          <w:instrText xml:space="preserve"> PAGEREF _Toc242739027 \h </w:instrText>
         </w:r>
         <w:r>
           <w:rPr>
@@ -3120,7 +3120,7 @@
           <w14:ligatures w14:val="standardContextual"/>
         </w:rPr>
       </w:pPr>
-      <w:hyperlink w:anchor="_Toc242737809" w:history="1">
+      <w:hyperlink w:anchor="_Toc242739028" w:history="1">
         <w:r>
           <w:rPr>
             <w:rStyle w:val="Hyperlink"/>
@@ -3147,7 +3147,7 @@
             <w:noProof/>
             <w:webHidden/>
           </w:rPr>
-          <w:instrText xml:space="preserve"> PAGEREF _Toc242737809 \h </w:instrText>
+          <w:instrText xml:space="preserve"> PAGEREF _Toc242739028 \h </w:instrText>
         </w:r>
         <w:r>
           <w:rPr>
@@ -3193,7 +3193,7 @@
           <w14:ligatures w14:val="standardContextual"/>
         </w:rPr>
       </w:pPr>
-      <w:hyperlink w:anchor="_Toc242737810" w:history="1">
+      <w:hyperlink w:anchor="_Toc242739029" w:history="1">
         <w:r>
           <w:rPr>
             <w:rStyle w:val="Hyperlink"/>
@@ -3220,7 +3220,7 @@
             <w:noProof/>
             <w:webHidden/>
           </w:rPr>
-          <w:instrText xml:space="preserve"> PAGEREF _Toc242737810 \h </w:instrText>
+          <w:instrText xml:space="preserve"> PAGEREF _Toc242739029 \h </w:instrText>
         </w:r>
         <w:r>
           <w:rPr>
@@ -3266,7 +3266,7 @@
           <w14:ligatures w14:val="standardContextual"/>
         </w:rPr>
       </w:pPr>
-      <w:hyperlink w:anchor="_Toc242737811" w:history="1">
+      <w:hyperlink w:anchor="_Toc242739030" w:history="1">
         <w:r>
           <w:rPr>
             <w:rStyle w:val="Hyperlink"/>
@@ -3293,7 +3293,7 @@
             <w:noProof/>
             <w:webHidden/>
           </w:rPr>
-          <w:instrText xml:space="preserve"> PAGEREF _Toc242737811 \h </w:instrText>
+          <w:instrText xml:space="preserve"> PAGEREF _Toc242739030 \h </w:instrText>
         </w:r>
         <w:r>
           <w:rPr>
@@ -3339,7 +3339,7 @@
           <w14:ligatures w14:val="standardContextual"/>
         </w:rPr>
       </w:pPr>
-      <w:hyperlink w:anchor="_Toc242737812" w:history="1">
+      <w:hyperlink w:anchor="_Toc242739031" w:history="1">
         <w:r>
           <w:rPr>
             <w:rStyle w:val="Hyperlink"/>
@@ -3366,7 +3366,7 @@
             <w:noProof/>
             <w:webHidden/>
           </w:rPr>
-          <w:instrText xml:space="preserve"> PAGEREF _Toc242737812 \h </w:instrText>
+          <w:instrText xml:space="preserve"> PAGEREF _Toc242739031 \h </w:instrText>
         </w:r>
         <w:r>
           <w:rPr>
@@ -3412,7 +3412,7 @@
           <w14:ligatures w14:val="standardContextual"/>
         </w:rPr>
       </w:pPr>
-      <w:hyperlink w:anchor="_Toc242737813" w:history="1">
+      <w:hyperlink w:anchor="_Toc242739032" w:history="1">
         <w:r>
           <w:rPr>
             <w:rStyle w:val="Hyperlink"/>
@@ -3439,7 +3439,7 @@
             <w:noProof/>
             <w:webHidden/>
           </w:rPr>
-          <w:instrText xml:space="preserve"> PAGEREF _Toc242737813 \h </w:instrText>
+          <w:instrText xml:space="preserve"> PAGEREF _Toc242739032 \h </w:instrText>
         </w:r>
         <w:r>
           <w:rPr>
@@ -3485,7 +3485,7 @@
           <w14:ligatures w14:val="standardContextual"/>
         </w:rPr>
       </w:pPr>
-      <w:hyperlink w:anchor="_Toc242737814" w:history="1">
+      <w:hyperlink w:anchor="_Toc242739033" w:history="1">
         <w:r>
           <w:rPr>
             <w:rStyle w:val="Hyperlink"/>
@@ -3512,7 +3512,7 @@
             <w:noProof/>
             <w:webHidden/>
           </w:rPr>
-          <w:instrText xml:space="preserve"> PAGEREF _Toc242737814 \h </w:instrText>
+          <w:instrText xml:space="preserve"> PAGEREF _Toc242739033 \h </w:instrText>
         </w:r>
         <w:r>
           <w:rPr>
@@ -3558,7 +3558,7 @@
           <w14:ligatures w14:val="standardContextual"/>
         </w:rPr>
       </w:pPr>
-      <w:hyperlink w:anchor="_Toc242737815" w:history="1">
+      <w:hyperlink w:anchor="_Toc242739034" w:history="1">
         <w:r>
           <w:rPr>
             <w:rStyle w:val="Hyperlink"/>
@@ -3585,7 +3585,7 @@
             <w:noProof/>
             <w:webHidden/>
           </w:rPr>
-          <w:instrText xml:space="preserve"> PAGEREF _Toc242737815 \h </w:instrText>
+          <w:instrText xml:space="preserve"> PAGEREF _Toc242739034 \h </w:instrText>
         </w:r>
         <w:r>
           <w:rPr>
@@ -3631,7 +3631,7 @@
           <w14:ligatures w14:val="standardContextual"/>
         </w:rPr>
       </w:pPr>
-      <w:hyperlink w:anchor="_Toc242737816" w:history="1">
+      <w:hyperlink w:anchor="_Toc242739035" w:history="1">
         <w:r>
           <w:rPr>
             <w:rStyle w:val="Hyperlink"/>
@@ -3658,7 +3658,7 @@
             <w:noProof/>
             <w:webHidden/>
           </w:rPr>
-          <w:instrText xml:space="preserve"> PAGEREF _Toc242737816 \h </w:instrText>
+          <w:instrText xml:space="preserve"> PAGEREF _Toc242739035 \h </w:instrText>
         </w:r>
         <w:r>
           <w:rPr>
@@ -3704,7 +3704,7 @@
           <w14:ligatures w14:val="standardContextual"/>
         </w:rPr>
       </w:pPr>
-      <w:hyperlink w:anchor="_Toc242737817" w:history="1">
+      <w:hyperlink w:anchor="_Toc242739036" w:history="1">
         <w:r>
           <w:rPr>
             <w:rStyle w:val="Hyperlink"/>
@@ -3731,7 +3731,7 @@
             <w:noProof/>
             <w:webHidden/>
           </w:rPr>
-          <w:instrText xml:space="preserve"> PAGEREF _Toc242737817 \h </w:instrText>
+          <w:instrText xml:space="preserve"> PAGEREF _Toc242739036 \h </w:instrText>
         </w:r>
         <w:r>
           <w:rPr>
@@ -3777,7 +3777,7 @@
           <w14:ligatures w14:val="standardContextual"/>
         </w:rPr>
       </w:pPr>
-      <w:hyperlink w:anchor="_Toc242737818" w:history="1">
+      <w:hyperlink w:anchor="_Toc242739037" w:history="1">
         <w:r>
           <w:rPr>
             <w:rStyle w:val="Hyperlink"/>
@@ -3804,7 +3804,7 @@
             <w:noProof/>
             <w:webHidden/>
           </w:rPr>
-          <w:instrText xml:space="preserve"> PAGEREF _Toc242737818 \h </w:instrText>
+          <w:instrText xml:space="preserve"> PAGEREF _Toc242739037 \h </w:instrText>
         </w:r>
         <w:r>
           <w:rPr>
@@ -3850,7 +3850,7 @@
           <w14:ligatures w14:val="standardContextual"/>
         </w:rPr>
       </w:pPr>
-      <w:hyperlink w:anchor="_Toc242737819" w:history="1">
+      <w:hyperlink w:anchor="_Toc242739038" w:history="1">
         <w:r>
           <w:rPr>
             <w:rStyle w:val="Hyperlink"/>
@@ -3877,7 +3877,7 @@
             <w:noProof/>
             <w:webHidden/>
           </w:rPr>
-          <w:instrText xml:space="preserve"> PAGEREF _Toc242737819 \h </w:instrText>
+          <w:instrText xml:space="preserve"> PAGEREF _Toc242739038 \h </w:instrText>
         </w:r>
         <w:r>
           <w:rPr>
@@ -3923,7 +3923,7 @@
           <w14:ligatures w14:val="standardContextual"/>
         </w:rPr>
       </w:pPr>
-      <w:hyperlink w:anchor="_Toc242737820" w:history="1">
+      <w:hyperlink w:anchor="_Toc242739039" w:history="1">
         <w:r>
           <w:rPr>
             <w:rStyle w:val="Hyperlink"/>
@@ -3950,7 +3950,7 @@
             <w:noProof/>
             <w:webHidden/>
           </w:rPr>
-          <w:instrText xml:space="preserve"> PAGEREF _Toc242737820 \h </w:instrText>
+          <w:instrText xml:space="preserve"> PAGEREF _Toc242739039 \h </w:instrText>
         </w:r>
         <w:r>
           <w:rPr>
@@ -3996,7 +3996,7 @@
           <w14:ligatures w14:val="standardContextual"/>
         </w:rPr>
       </w:pPr>
-      <w:hyperlink w:anchor="_Toc242737821" w:history="1">
+      <w:hyperlink w:anchor="_Toc242739040" w:history="1">
         <w:r>
           <w:rPr>
             <w:rStyle w:val="Hyperlink"/>
@@ -4023,7 +4023,7 @@
             <w:noProof/>
             <w:webHidden/>
           </w:rPr>
-          <w:instrText xml:space="preserve"> PAGEREF _Toc242737821 \h </w:instrText>
+          <w:instrText xml:space="preserve"> PAGEREF _Toc242739040 \h </w:instrText>
         </w:r>
         <w:r>
           <w:rPr>
@@ -4069,7 +4069,7 @@
           <w14:ligatures w14:val="standardContextual"/>
         </w:rPr>
       </w:pPr>
-      <w:hyperlink w:anchor="_Toc242737822" w:history="1">
+      <w:hyperlink w:anchor="_Toc242739041" w:history="1">
         <w:r>
           <w:rPr>
             <w:rStyle w:val="Hyperlink"/>
@@ -4096,7 +4096,7 @@
             <w:noProof/>
             <w:webHidden/>
           </w:rPr>
-          <w:instrText xml:space="preserve"> PAGEREF _Toc242737822 \h </w:instrText>
+          <w:instrText xml:space="preserve"> PAGEREF _Toc242739041 \h </w:instrText>
         </w:r>
         <w:r>
           <w:rPr>
@@ -4142,7 +4142,7 @@
           <w14:ligatures w14:val="standardContextual"/>
         </w:rPr>
       </w:pPr>
-      <w:hyperlink w:anchor="_Toc242737823" w:history="1">
+      <w:hyperlink w:anchor="_Toc242739042" w:history="1">
         <w:r>
           <w:rPr>
             <w:rStyle w:val="Hyperlink"/>
@@ -4169,7 +4169,7 @@
             <w:noProof/>
             <w:webHidden/>
           </w:rPr>
-          <w:instrText xml:space="preserve"> PAGEREF _Toc242737823 \h </w:instrText>
+          <w:instrText xml:space="preserve"> PAGEREF _Toc242739042 \h </w:instrText>
         </w:r>
         <w:r>
           <w:rPr>
@@ -4215,7 +4215,7 @@
           <w14:ligatures w14:val="standardContextual"/>
         </w:rPr>
       </w:pPr>
-      <w:hyperlink w:anchor="_Toc242737824" w:history="1">
+      <w:hyperlink w:anchor="_Toc242739043" w:history="1">
         <w:r>
           <w:rPr>
             <w:rStyle w:val="Hyperlink"/>
@@ -4242,7 +4242,7 @@
             <w:noProof/>
             <w:webHidden/>
           </w:rPr>
-          <w:instrText xml:space="preserve"> PAGEREF _Toc242737824 \h </w:instrText>
+          <w:instrText xml:space="preserve"> PAGEREF _Toc242739043 \h </w:instrText>
         </w:r>
         <w:r>
           <w:rPr>
@@ -4288,7 +4288,7 @@
           <w14:ligatures w14:val="standardContextual"/>
         </w:rPr>
       </w:pPr>
-      <w:hyperlink w:anchor="_Toc242737825" w:history="1">
+      <w:hyperlink w:anchor="_Toc242739044" w:history="1">
         <w:r>
           <w:rPr>
             <w:rStyle w:val="Hyperlink"/>
@@ -4315,7 +4315,7 @@
             <w:noProof/>
             <w:webHidden/>
           </w:rPr>
-          <w:instrText xml:space="preserve"> PAGEREF _Toc242737825 \h </w:instrText>
+          <w:instrText xml:space="preserve"> PAGEREF _Toc242739044 \h </w:instrText>
         </w:r>
         <w:r>
           <w:rPr>
@@ -4366,7 +4366,7 @@
       <w:pPr>
         <w:pStyle w:val="Ttulo1"/>
       </w:pPr>
-      <w:bookmarkStart w:id="0" w:name="_Toc242737786"/>
+      <w:bookmarkStart w:id="0" w:name="_Toc242739005"/>
       <w:r>
         <w:lastRenderedPageBreak/>
         <w:t>1 INTRODUÇÃO</w:t>
@@ -4381,7 +4381,7 @@
         <w:t>A nota média de um anúncio no Airbnb resume a opinião de dezenas ou centenas de hóspedes em um único número entre 1 e 5. Esse número é quase sempre alto. Em uma análise de anúncios da plataforma, Zervas, Proserpio e Byers (2021)</w:t>
       </w:r>
       <w:r>
-        <w:t xml:space="preserve"> encontraram que cerca de 95% dos anúncios exibem média de 4,5 ou 5 estrelas. A literatura sobre avaliações online descreve distribuições concentradas no topo da escala em outros mercados (FILIPPAS; HORTON; GOLDEN, 2022; HU; ZHANG; PAVLOU, 2009). Os dados deste estudo repetem o padrão: entre os 28.890 anúncios do Rio de Janeiro analisados, 9.373 (32,4%) têm nota exatamente igual a 5,0. Uma nota tão comprimida distingue mal os anúncios entre si e diz pouco sobre o que levou o hóspede a avaliar bem ou mal.</w:t>
+        <w:t xml:space="preserve"> encontraram que cerca de 95% dos anúncios exibem média de 4,5 ou 5 estrelas. A literatura sobre avaliações online descreve distribuições concentradas no topo da escala em outros mercados (Filippas; Horton; Golden, 2022; Hu; Zhang; Pavlou, 2009). Os dados deste estudo repetem o padrão: entre os 28.890 anúncios do Rio de Janeiro analisados, 9.373 (32,4%) têm nota exatamente igual a 5,0. Uma nota tão comprimida distingue mal os anúncios entre si e diz pouco sobre o que levou o hóspede a avaliar bem ou mal.</w:t>
       </w:r>
     </w:p>
     <w:p>
@@ -4441,7 +4441,7 @@
       <w:pPr>
         <w:pStyle w:val="Ttulo1"/>
       </w:pPr>
-      <w:bookmarkStart w:id="1" w:name="_Toc242737787"/>
+      <w:bookmarkStart w:id="1" w:name="_Toc242739006"/>
       <w:r>
         <w:lastRenderedPageBreak/>
         <w:t>2 REFERENCIAL TEÓRICO</w:t>
@@ -4452,7 +4452,7 @@
       <w:pPr>
         <w:pStyle w:val="Ttulo2"/>
       </w:pPr>
-      <w:bookmarkStart w:id="2" w:name="_Toc242737788"/>
+      <w:bookmarkStart w:id="2" w:name="_Toc242739007"/>
       <w:r>
         <w:t>2.1 AVALIAÇÕES ONLINE: COMPRESSÃO DAS NOTAS E VIESES DE RELATO</w:t>
       </w:r>
@@ -4466,10 +4466,10 @@
         <w:t>Sistemas de avaliação produzem notas concentradas nos valores mais altos. Hu, Zhang e Pavlou (2009) descrevem a distribuição em forma de J das avaliações de produtos, com muitas notas máximas, algumas mínimas e poucas intermediárias e atribuem o padrão a vieses de quem decide avaliar. Dellarocas e Wood (2008)</w:t>
       </w:r>
       <w:r>
-        <w:t xml:space="preserve"> mostram, com dados do eBay, que a propensão a relatar depende do resultado da transação, o que distorce a distribuição das avaliações públicas em relação à experiência efetivamente vivida. Filippas, Horton e Golden (2022) tratam a inflação de reputação, isto é, a elevação das notas ao longo do tempo, como fator que reduz o conteúdo informativo desses sistemas no longo prazo. O efeito das avaliações sobre as vendas de livros é documentado há tempo (CHEVALIER; MAYZLIN, 2006)</w:t>
-      </w:r>
-      <w:r>
-        <w:t xml:space="preserve"> e as respostas das empresas às avaliações também alteram o que os clientes escrevem (PROSERPIO; ZERVAS, 2017).</w:t>
+        <w:t xml:space="preserve"> mostram, com dados do eBay, que a propensão a relatar depende do resultado da transação, o que distorce a distribuição das avaliações públicas em relação à experiência efetivamente vivida. Filippas, Horton e Golden (2022) tratam a inflação de reputação, isto é, a elevação das notas ao longo do tempo, como fator que reduz o conteúdo informativo desses sistemas no longo prazo. O efeito das avaliações sobre as vendas de livros é documentado há tempo (Chevalier; Mayzlin, 2006)</w:t>
+      </w:r>
+      <w:r>
+        <w:t xml:space="preserve"> e as respostas das empresas às avaliações também alteram o que os clientes escrevem (Proserpio; Zervas, 2017).</w:t>
       </w:r>
     </w:p>
     <w:p>
@@ -4477,14 +4477,14 @@
         <w:pStyle w:val="Corpodotexto"/>
       </w:pPr>
       <w:r>
-        <w:t>Na psicometria, a tendência de um julgamento global contaminar os julgamentos específicos recebe o nome de efeito halo (THORNDIKE, 1920). A noção importa para este estudo porque as subnotas oficiais do Airbnb (limpeza, localização, check-in e outras) são muito correlacionadas entre si. A correlação entre o sentimento de um aspecto e a sua subnota precisa, por isso, ser lida à luz desse efeito.</w:t>
+        <w:t>Na psicometria, a tendência de um julgamento global contaminar os julgamentos específicos recebe o nome de efeito halo (Thorndike, 1920). A noção importa para este estudo porque as subnotas oficiais do Airbnb (limpeza, localização, check-in e outras) são muito correlacionadas entre si. A correlação entre o sentimento de um aspecto e a sua subnota precisa, por isso, ser lida à luz desse efeito.</w:t>
       </w:r>
     </w:p>
     <w:p>
       <w:pPr>
         <w:pStyle w:val="Ttulo2"/>
       </w:pPr>
-      <w:bookmarkStart w:id="3" w:name="_Toc242737789"/>
+      <w:bookmarkStart w:id="3" w:name="_Toc242739008"/>
       <w:r>
         <w:t>2.2 AS AVALIAÇÕES DO AIRBNB E O SEU CONTEÚDO</w:t>
       </w:r>
@@ -4501,7 +4501,7 @@
         <w:t xml:space="preserve"> realizaram um experimento na plataforma em que o feedback ficava oculto até que as duas partes avaliassem e observaram menos retaliação e reciprocidade nas avaliações e, em consequência, notas mais baixas. Bridges e Vásquez (2018)</w:t>
       </w:r>
       <w:r>
-        <w:t xml:space="preserve"> analisam a linguagem das avaliações e concluem que elas recorrem a um conjunto restrito de recursos linguísticos, o que estabelece uma norma de comentário muito positivo, embora experiências menos favoráveis possam ser sinalizadas por indícios mais sutis. Um trabalho com dados do Brasil e dos Estados Unidos compara o sentimento das avaliações do Airbnb, do Couchsurfing e do Booking.com e encontra avaliações consideravelmente mais positivas nas plataformas de economia compartilhada (SANTOS et al., 2020).</w:t>
+        <w:t xml:space="preserve"> analisam a linguagem das avaliações e concluem que elas recorrem a um conjunto restrito de recursos linguísticos, o que estabelece uma norma de comentário muito positivo, embora experiências menos favoráveis possam ser sinalizadas por indícios mais sutis. Um trabalho com dados do Brasil e dos Estados Unidos compara o sentimento das avaliações do Airbnb, do Couchsurfing e do Booking.com e encontra avaliações consideravelmente mais positivas nas plataformas de economia compartilhada (Santos et al., 2020).</w:t>
       </w:r>
     </w:p>
     <w:p>
@@ -4520,7 +4520,7 @@
       <w:pPr>
         <w:pStyle w:val="Ttulo2"/>
       </w:pPr>
-      <w:bookmarkStart w:id="4" w:name="_Toc242737790"/>
+      <w:bookmarkStart w:id="4" w:name="_Toc242739009"/>
       <w:r>
         <w:t>2.3 DETERMINANTES DE PREÇO E DE REPUTAÇÃO</w:t>
       </w:r>
@@ -4531,10 +4531,10 @@
         <w:pStyle w:val="Corpodotexto"/>
       </w:pPr>
       <w:r>
-        <w:t>Outra vertente da literatura procura explicar o preço e a demanda dos anúncios. Estudos de preço com regressão hedônica, quantílica e espacial mostram que localização, tamanho, comodidades e reputação online se associam ao preço (CHICA-OLMO; GONZÁLEZ-MORALES; ZAFRA-GÓMEZ, 2020; GYÓDI; NAWARO, 2021; WANG; NICOLAU, 2017)</w:t>
-      </w:r>
-      <w:r>
-        <w:t>. Em Nova York, a localização, sobretudo a acessibilidade ao transporte, tem grande efeito sobre o preço e a receita. A profissionalização do mercado concentra a receita em uma fração menor de anfitriões (DEBOOSERE et al., 2019)</w:t>
+        <w:t>Outra vertente da literatura procura explicar o preço e a demanda dos anúncios. Estudos de preço com regressão hedônica, quantílica e espacial mostram que localização, tamanho, comodidades e reputação online se associam ao preço (Chica-Olmo; González-Morales; Zafra-Gómez, 2020; Gyódi; Nawaro, 2021; Wang; Nicolau, 2017)</w:t>
+      </w:r>
+      <w:r>
+        <w:t>. Em Nova York, a localização, sobretudo a acessibilidade ao transporte, tem grande efeito sobre o preço e a receita. A profissionalização do mercado concentra a receita em uma fração menor de anfitriões (Deboosere et al., 2019)</w:t>
       </w:r>
       <w:r>
         <w:t>. Esses trabalhos tomam preço, ocupação ou receita como variáveis de interesse. Neste estudo o objeto é a nota e o texto que a acompanha. As medidas de volume entram como desfecho auxiliar, com a ressalva, estabelecida na Seção 3, de que os campos de ocupação e receita estimadas da base são funções do número de avaliações.</w:t>
@@ -4544,7 +4544,7 @@
       <w:pPr>
         <w:pStyle w:val="Ttulo2"/>
       </w:pPr>
-      <w:bookmarkStart w:id="5" w:name="_Toc242737791"/>
+      <w:bookmarkStart w:id="5" w:name="_Toc242739010"/>
       <w:r>
         <w:t>2.4 ANÁLISE DE SENTIMENTO POR ASPECTO E MODELOS DE LINGUAGEM</w:t>
       </w:r>
@@ -4555,14 +4555,14 @@
         <w:pStyle w:val="Corpodotexto"/>
       </w:pPr>
       <w:r>
-        <w:t>A análise de sentimento por aspecto consiste em identificar os aspectos de uma entidade mencionados no texto e o sentimento expresso sobre cada um (LIU, 2012). As tarefas compartilhadas do SemEval consolidaram a formulação e os conjuntos de dados da área (PONTIKI et al., 2014; PONTIKI et al., 2016) e levantamentos recentes organizam os métodos e os desafios (SCHOUTEN; FRASINCAR, 2016; ZHANG et al., 2023). Os modelos atuais de linguagem derivam do BERT (DEVLIN et al., 2019)</w:t>
-      </w:r>
-      <w:r>
-        <w:t xml:space="preserve">. Para corpora multilíngues como o desta pesquisa, empregam-se modelos multilíngues como o XLM-T, treinado em mensagens de uma rede social em vários idiomas (BARBIERI; ESPINOSA ANKE; </w:t>
+        <w:t>A análise de sentimento por aspecto consiste em identificar os aspectos de uma entidade mencionados no texto e o sentimento expresso sobre cada um (Liu, 2012). As tarefas compartilhadas do SemEval consolidaram a formulação e os conjuntos de dados da área (Pontiki et al., 2014; Pontiki et al., 2016) e levantamentos recentes organizam os métodos e os desafios (Schouten; Frasincar, 2016; Zhang et al., 2023). Os modelos atuais de linguagem derivam do BERT (Devlin et al., 2019)</w:t>
+      </w:r>
+      <w:r>
+        <w:t xml:space="preserve">. Para corpora multilíngues como o desta pesquisa, empregam-se modelos multilíngues como o XLM-T, treinado em mensagens de uma rede social em vários idiomas (Barbieri; Espinosa Anke; Camacho-Collados, 2022). Para o português, existem modelos específicos, como o BERTimbau (Souza, 2020) e trabalhos de </w:t>
       </w:r>
       <w:r>
         <w:lastRenderedPageBreak/>
-        <w:t>CAMACHO-COLLADOS, 2022). Para o português, existem modelos específicos, como o BERTimbau (SOUZA, 2020) e trabalhos de mineração de opinião sobre avaliações em português (FREITAS; VIEIRA, 2013)</w:t>
+        <w:t>mineração de opinião sobre avaliações em português (Freitas; Vieira, 2013)</w:t>
       </w:r>
       <w:r>
         <w:t>. Não identificamos, na busca realizada, estudo anterior de análise de sentimento por aspecto sobre avaliações de hospedagem do Rio de Janeiro.</w:t>
@@ -4572,7 +4572,7 @@
       <w:pPr>
         <w:pStyle w:val="Ttulo2"/>
       </w:pPr>
-      <w:bookmarkStart w:id="6" w:name="_Toc242737792"/>
+      <w:bookmarkStart w:id="6" w:name="_Toc242739011"/>
       <w:r>
         <w:t>2.5 MODELAGEM DE TÓPICOS</w:t>
       </w:r>
@@ -4583,10 +4583,10 @@
         <w:pStyle w:val="Corpodotexto"/>
       </w:pPr>
       <w:r>
-        <w:t xml:space="preserve">O LDA (BLEI; NG; JORDAN, 2003) é o método clássico de modelagem de tópicos probabilística. O BERTopic (GROOTENDORST, 2022) agrupa representações vetoriais de sentenças (REIMERS; GUREVYCH, 2019; REIMERS; GUREVYCH, 2020), após redução de dimensão por UMAP (MCINNES; HEALY; MELVILLE, 2018) e agrupamento por densidade </w:t>
-      </w:r>
-      <w:r>
-        <w:t xml:space="preserve">(MCINNES; HEALY; ASTELS, 2017) e descreve cada grupo por termos de maior peso. A coerência </w:t>
+        <w:t xml:space="preserve">O LDA (Blei; Ng; Jordan, 2003) é o método clássico de modelagem de tópicos probabilística. O BERTopic (Grootendorst, 2022) agrupa representações vetoriais de sentenças (Reimers; Gurevych, 2019; Reimers; Gurevych, 2020), após redução de dimensão por UMAP (McInnes; Healy; Melville, 2018) e agrupamento por densidade </w:t>
+      </w:r>
+      <w:r>
+        <w:t xml:space="preserve">(McInnes; Healy; Astels, 2017) e descreve cada grupo por termos de maior peso. A coerência </w:t>
       </w:r>
       <w:r>
         <w:rPr>
@@ -4601,14 +4601,14 @@
         <w:t>v</w:t>
       </w:r>
       <w:r>
-        <w:t xml:space="preserve"> (RÖDER; BOTH; HINNEBURG, 2015) é a medida usual para comparar a qualidade interpretável dos tópicos e neste estudo é empregada apenas de forma descritiva.</w:t>
+        <w:t xml:space="preserve"> (Röder; Both; Hinneburg, 2015) é a medida usual para comparar a qualidade interpretável dos tópicos e neste estudo é empregada apenas de forma descritiva.</w:t>
       </w:r>
     </w:p>
     <w:p>
       <w:pPr>
         <w:pStyle w:val="Ttulo2"/>
       </w:pPr>
-      <w:bookmarkStart w:id="7" w:name="_Toc242737793"/>
+      <w:bookmarkStart w:id="7" w:name="_Toc242739012"/>
       <w:r>
         <w:t>2.6 VALIDAÇÃO, CONCORDÂNCIA E IMPORTÂNCIA RELATIVA</w:t>
       </w:r>
@@ -4619,10 +4619,10 @@
         <w:pStyle w:val="Corpodotexto"/>
       </w:pPr>
       <w:r>
-        <w:t xml:space="preserve">A concordância entre avaliadores é medida pelo coeficiente kappa (COHEN, 1960), em sua versão ponderada quando as categorias são ordenadas (COHEN, 1968) e sua interpretação segue faixas convencionais </w:t>
-      </w:r>
-      <w:r>
-        <w:t xml:space="preserve">(LANDIS; KOCH, 1977), com as ressalvas discutidas em McHugh (2012). Quando a amostra rotulada é estratificada e se deseja estimar a medida na população, cada observação recebe o peso do seu estrato e o tamanho efetivo da amostra ponderada, descrito por Kish (1992), indica a precisão efetiva. A incerteza é estimada por </w:t>
+        <w:t xml:space="preserve">A concordância entre avaliadores é medida pelo coeficiente kappa (Cohen, 1960), em sua versão ponderada quando as categorias são ordenadas (Cohen, 1968) e sua interpretação segue faixas convencionais </w:t>
+      </w:r>
+      <w:r>
+        <w:t xml:space="preserve">(Landis; Koch, 1977), com as ressalvas discutidas em McHugh (2012). Quando a amostra rotulada é estratificada e se deseja estimar a medida na população, cada observação recebe o peso do seu estrato e o tamanho efetivo da amostra ponderada, descrito por Kish (1992), indica a precisão efetiva. A incerteza é estimada por </w:t>
       </w:r>
       <w:r>
         <w:rPr>
@@ -4631,7 +4631,7 @@
         <w:t>bootstrap</w:t>
       </w:r>
       <w:r>
-        <w:t xml:space="preserve"> (EFRON, 1979). A confiabilidade de uma medida obtida de duas metades dos dados é ajustada pela fórmula de Spearman-Brown (BROWN, 1910; SPEARMAN, 1910)</w:t>
+        <w:t xml:space="preserve"> (Efron, 1979). A confiabilidade de uma medida obtida de duas metades dos dados é ajustada pela fórmula de Spearman-Brown (Brown, 1910; Spearman, 1910)</w:t>
       </w:r>
       <w:r>
         <w:t xml:space="preserve">. A importância relativa de preditores correlacionados é decomposta pelo método LMG, equivalente à média de Shapley do </w:t>
@@ -4649,36 +4649,36 @@
         <w:t>2</w:t>
       </w:r>
       <w:r>
-        <w:t xml:space="preserve"> (GRÖMPING, 2006; GRÖMPING, 2007; LINDEMAN; MERENDA; GOLD, 1980). A correção de Benjamini e Hochberg (BENJAMINI; HOCHBERG, 1995) controla a taxa de falsas descobertas em comparações múltiplas e o encolhimento bayesiano empírico (EFRON; MORRIS, 1975) fundamenta a opção de ponderar a média de anúncios com poucas avaliações em direção à média global.</w:t>
+        <w:t xml:space="preserve"> (Grömping, 2006; Grömping, 2007; Lindeman; Merenda; Gold, 1980). A correção de Benjamini e Hochberg (Benjamini; Hochberg, 1995) controla a taxa de falsas descobertas em comparações múltiplas e o encolhimento bayesiano empírico (Efron; Morris, 1975) fundamenta a opção de ponderar a média de anúncios com poucas avaliações em direção à média global.</w:t>
       </w:r>
     </w:p>
     <w:p>
       <w:pPr>
         <w:pStyle w:val="Ttulo2"/>
       </w:pPr>
-      <w:bookmarkStart w:id="8" w:name="_Toc242737794"/>
+      <w:bookmarkStart w:id="8" w:name="_Toc242739013"/>
+      <w:r>
+        <w:t>2.7 LACUNA</w:t>
+      </w:r>
+      <w:bookmarkEnd w:id="8"/>
+    </w:p>
+    <w:p>
+      <w:pPr>
+        <w:pStyle w:val="Corpodotexto"/>
+      </w:pPr>
+      <w:r>
+        <w:t xml:space="preserve">A literatura revisada documenta a compressão das notas, descreve os temas das avaliações do Airbnb e aplica modelos de linguagem à análise por aspecto. Faltam, em </w:t>
+      </w:r>
       <w:r>
         <w:lastRenderedPageBreak/>
-        <w:t>2.7 LACUNA</w:t>
-      </w:r>
-      <w:bookmarkEnd w:id="8"/>
-    </w:p>
-    <w:p>
-      <w:pPr>
-        <w:pStyle w:val="Corpodotexto"/>
-      </w:pPr>
-      <w:r>
-        <w:t>A literatura revisada documenta a compressão das notas, descreve os temas das avaliações do Airbnb e aplica modelos de linguagem à análise por aspecto. Faltam, em conjunto, quatro elementos que este trabalho reúne: a validação explícita da medida por aspecto com amostra ponderada pela população e com mais de um anotador; a comparação entre dois modelos de sentimento com regra de escolha fixada de antemão; a decomposição da nota global por aspecto e por tópico em um corpus multilíngue de um mercado brasileir</w:t>
-      </w:r>
-      <w:r>
-        <w:t>o; e a verificação de que o índice sintético construído a partir do texto não acrescenta poder explicativo à nota oficial.</w:t>
+        <w:t>conjunto, quatro elementos que este trabalho reúne: a validação explícita da medida por aspecto com amostra ponderada pela população e com mais de um anotador; a comparação entre dois modelos de sentimento com regra de escolha fixada de antemão; a decomposição da nota global por aspecto e por tópico em um corpus multilíngue de um mercado brasileiro; e a verificação de que o índice sintético construído a partir do texto não acrescenta poder explicativo à nota oficial.</w:t>
       </w:r>
     </w:p>
     <w:p>
       <w:pPr>
         <w:pStyle w:val="Ttulo1"/>
       </w:pPr>
-      <w:bookmarkStart w:id="9" w:name="_Toc242737795"/>
+      <w:bookmarkStart w:id="9" w:name="_Toc242739014"/>
       <w:r>
         <w:lastRenderedPageBreak/>
         <w:t>3 DADOS E MÉTODO</w:t>
@@ -4697,7 +4697,7 @@
       <w:pPr>
         <w:pStyle w:val="Ttulo2"/>
       </w:pPr>
-      <w:bookmarkStart w:id="10" w:name="_Toc242737796"/>
+      <w:bookmarkStart w:id="10" w:name="_Toc242739015"/>
       <w:r>
         <w:t>3.1 BASE E RECORTE</w:t>
       </w:r>
@@ -4708,7 +4708,7 @@
         <w:pStyle w:val="Corpodotexto"/>
       </w:pPr>
       <w:r>
-        <w:t>A base provém do projeto Inside Airbnb (INSIDE AIRBNB, 2026)</w:t>
+        <w:t>A base provém do projeto Inside Airbnb (Inside Airbnb, 2026)</w:t>
       </w:r>
       <w:r>
         <w:t xml:space="preserve"> e reúne 42.013 anúncios do Rio de Janeiro e 995.072 avaliações textuais. Entre os anúncios, 33.140 possuem nota global e as seis subnotas oficiais (limpeza, localização, check-in, comunicação, custo-benefício e precisão do anúncio). Foram considerados elegíveis os que têm nota maior que zero e ao menos duas avaliações, o que resulta em 28.890 anúncios.</w:t>
@@ -4743,7 +4743,7 @@
       <w:pPr>
         <w:pStyle w:val="Ttulo2"/>
       </w:pPr>
-      <w:bookmarkStart w:id="11" w:name="_Toc242737797"/>
+      <w:bookmarkStart w:id="11" w:name="_Toc242739016"/>
       <w:r>
         <w:t>3.2 O QUE A BASE PERMITE MEDIR</w:t>
       </w:r>
@@ -4838,7 +4838,7 @@
       </w:r>
       <w:r>
         <w:lastRenderedPageBreak/>
-        <w:t>(100,0% dos casos). A construção segue o modelo descrito pelo Inside Airbnb, que converte avaliações em reservas com taxa de avaliação de 50% e estadia média de três noites (INSIDE AIRBNB, 2026)</w:t>
+        <w:t>(100,0% dos casos). A construção segue o modelo descrito pelo Inside Airbnb, que converte avaliações em reservas com taxa de avaliação de 50% e estadia média de três noites (Inside Airbnb, 2026)</w:t>
       </w:r>
       <w:r>
         <w:t>. Na faixa de nota 5,0, a correlação de postos entre a ocupação estimada e o número de avaliações dos últimos 12 meses é 0,97.</w:t>
@@ -4859,7 +4859,7 @@
       <w:pPr>
         <w:pStyle w:val="Ttulo2"/>
       </w:pPr>
-      <w:bookmarkStart w:id="12" w:name="_Toc242737798"/>
+      <w:bookmarkStart w:id="12" w:name="_Toc242739017"/>
       <w:r>
         <w:t>3.3 MEDIÇÃO DO SENTIMENTO</w:t>
       </w:r>
@@ -4880,7 +4880,7 @@
         <w:t>cardiffnlp/twitter-xlm-roberta-base-sentiment</w:t>
       </w:r>
       <w:r>
-        <w:t xml:space="preserve">) é um classificador multilíngue treinado em mensagens de uma rede social (BARBIERI; ESPINOSA ANKE; CAMACHO-COLLADOS, 2022; CARDIFF NLP, 2023), com três classes: negativo, neutro e positivo. Sua saída foi convertida em estrelas esperadas pela expressão 1 · </w:t>
+        <w:t xml:space="preserve">) é um classificador multilíngue treinado em mensagens de uma rede social (Barbieri; Espinosa Anke; Camacho-Collados, 2022; Cardiff NLP, 2023), com três classes: negativo, neutro e positivo. Sua saída foi convertida em estrelas esperadas pela expressão 1 · </w:t>
       </w:r>
       <w:r>
         <w:rPr>
@@ -4944,7 +4944,7 @@
         <w:t>nlptown/bert-base-multilingual-uncased-sentiment</w:t>
       </w:r>
       <w:r>
-        <w:t xml:space="preserve">) é um modelo multilíngue da família BERT (DEVLIN et al., 2019) ajustado a avaliações de produtos (NLP TOWN, 2025), com cinco classes que correspondem a 1 a 5 estrelas. As estrelas esperadas são </w:t>
+        <w:t xml:space="preserve">) é um modelo multilíngue da família BERT (Devlin et al., 2019) ajustado a avaliações de produtos (NLP Town, 2025), com cinco classes que correspondem a 1 a 5 estrelas. As estrelas esperadas são </w:t>
       </w:r>
       <w:r>
         <w:rPr>
@@ -4994,10 +4994,10 @@
         <w:pStyle w:val="Corpodotexto"/>
       </w:pPr>
       <w:r>
-        <w:t>A polaridade discreta de A é a mais provável entre as três classes. Em B, a polaridade é negativa quando a classe mais provável tem 1 ou 2 estrelas, neutra quando tem 3 e positiva quando tem 4 ou 5. Os modelos foram aplicados às mesmas 1.512.063 sentenças (1.366.091 textos únicos), com a biblioteca Transformers (WOLF et al., 2020)</w:t>
-      </w:r>
-      <w:r>
-        <w:t>. As estrelas médias por texto único são 4,19 em A e 4,06 em B. A proporção de sentenças com quatro estrelas ou mais é 75,1% e 70,0%. As polaridades (negativa, neutra e positiva) distribuem-se em 6,8%, 14,3% e 78,9% em A e em 10,4%, 8,1% e 81,5% em B. Nos dois casos a maior parte das sentenças é positiva, o que reproduz no texto o viés de positividade das avaliações online (BRIDGES; VÁSQUEZ, 2018; ZERVAS; PROSERPIO; BYERS, 2021).</w:t>
+        <w:t>A polaridade discreta de A é a mais provável entre as três classes. Em B, a polaridade é negativa quando a classe mais provável tem 1 ou 2 estrelas, neutra quando tem 3 e positiva quando tem 4 ou 5. Os modelos foram aplicados às mesmas 1.512.063 sentenças (1.366.091 textos únicos), com a biblioteca Transformers (Wolf et al., 2020)</w:t>
+      </w:r>
+      <w:r>
+        <w:t>. As estrelas médias por texto único são 4,19 em A e 4,06 em B. A proporção de sentenças com quatro estrelas ou mais é 75,1% e 70,0%. As polaridades (negativa, neutra e positiva) distribuem-se em 6,8%, 14,3% e 78,9% em A e em 10,4%, 8,1% e 81,5% em B. Nos dois casos a maior parte das sentenças é positiva, o que reproduz no texto o viés de positividade das avaliações online (Bridges; Vásquez, 2018; Zervas; Proserpio; Byers, 2021).</w:t>
       </w:r>
     </w:p>
     <w:p>
@@ -5023,14 +5023,14 @@
         <w:t>bootstrap</w:t>
       </w:r>
       <w:r>
-        <w:t xml:space="preserve"> estratificado (EFRON, 1979), excluísse zero a favor de B. Caso contrário, o principal seria A. O outro modelo é reportado em todos os resultados como análise de robustez. O kappa populacional é calculado sobre sentenças rotuladas manualmente e ponderadas pelo tamanho dos estratos de origem, como detalhado na Seção 4.</w:t>
+        <w:t xml:space="preserve"> estratificado (Efron, 1979), excluísse zero a favor de B. Caso contrário, o principal seria A. O outro modelo é reportado em todos os resultados como análise de robustez. O kappa populacional é calculado sobre sentenças rotuladas manualmente e ponderadas pelo tamanho dos estratos de origem, como detalhado na Seção 4.</w:t>
       </w:r>
     </w:p>
     <w:p>
       <w:pPr>
         <w:pStyle w:val="Ttulo2"/>
       </w:pPr>
-      <w:bookmarkStart w:id="13" w:name="_Toc242737799"/>
+      <w:bookmarkStart w:id="13" w:name="_Toc242739018"/>
       <w:r>
         <w:t>3.4 TÓPICOS E ASPECTOS</w:t>
       </w:r>
@@ -5041,7 +5041,7 @@
         <w:pStyle w:val="Corpodotexto"/>
       </w:pPr>
       <w:r>
-        <w:t xml:space="preserve">As sentenças foram agrupadas pelo BERTopic (GROOTENDORST, 2022), que combina </w:t>
+        <w:t xml:space="preserve">As sentenças foram agrupadas pelo BERTopic (Grootendorst, 2022), que combina </w:t>
       </w:r>
       <w:r>
         <w:rPr>
@@ -5069,7 +5069,7 @@
         <w:t>paraphrase-multilingual-MiniLM-L12-v2</w:t>
       </w:r>
       <w:r>
-        <w:t xml:space="preserve"> (REIMERS; GUREVYCH, 2020), a redução por UMAP (MCINNES; HEALY; MELVILLE, 2018) e o agrupamento por HDBSCAN (MCINNES; HEALY; ASTELS, 2017)</w:t>
+        <w:t xml:space="preserve"> (Reimers; Gurevych, 2020), a redução por UMAP (McInnes; Healy; Melville, 2018) e o agrupamento por HDBSCAN (McInnes; Healy; Astels, 2017)</w:t>
       </w:r>
       <w:r>
         <w:t xml:space="preserve">. O ajuste foi feito em uma amostra de 200.000 sentenças. O modelo foi aplicado às demais. Resultaram 185 tópicos. Na amostra de ajuste, 29,8% das sentenças foram classificadas como ruído; depois da reatribuição ao centroide mais próximo, o ruído caiu a 1,0% dos textos. Distinguem-se, assim, as sentenças com tópico direto (atribuídas pelo próprio BERTopic) e as reatribuídas, cuja atribuição é menos precisa (Seção 4). A coerência </w:t>
@@ -5087,7 +5087,7 @@
         <w:t>v</w:t>
       </w:r>
       <w:r>
-        <w:t xml:space="preserve"> (RÖDER; BOTH; HINNEBURG, 2015) média dos tópicos é 0,388.</w:t>
+        <w:t xml:space="preserve"> (Röder; Both; Hinneburg, 2015) média dos tópicos é 0,388.</w:t>
       </w:r>
     </w:p>
     <w:p>
@@ -5095,7 +5095,7 @@
         <w:pStyle w:val="Corpodotexto"/>
       </w:pPr>
       <w:r>
-        <w:t xml:space="preserve">Como método de checagem, ajustou-se também um modelo LDA (BLEI; NG; JORDAN, 2003) com </w:t>
+        <w:t xml:space="preserve">Como método de checagem, ajustou-se também um modelo LDA (Blei; Ng; Jordan, 2003) com </w:t>
       </w:r>
       <w:r>
         <w:rPr>
@@ -5168,7 +5168,7 @@
       <w:pPr>
         <w:pStyle w:val="Ttulo2"/>
       </w:pPr>
-      <w:bookmarkStart w:id="14" w:name="_Toc242737800"/>
+      <w:bookmarkStart w:id="14" w:name="_Toc242739019"/>
       <w:r>
         <w:t>3.5 PERFIL POR ANÚNCIO</w:t>
       </w:r>
@@ -5188,7 +5188,7 @@
         <w:keepNext/>
         <w:spacing w:before="120" w:after="80"/>
       </w:pPr>
-      <w:bookmarkStart w:id="15" w:name="_Toc242737826"/>
+      <w:bookmarkStart w:id="15" w:name="_Toc242739045"/>
       <w:r>
         <w:rPr>
           <w:b w:val="0"/>
@@ -5966,7 +5966,7 @@
       <w:pPr>
         <w:pStyle w:val="Ttulo2"/>
       </w:pPr>
-      <w:bookmarkStart w:id="16" w:name="_Toc242737801"/>
+      <w:bookmarkStart w:id="16" w:name="_Toc242739020"/>
       <w:r>
         <w:t>3.6 DESENHO ANALÍTICO</w:t>
       </w:r>
@@ -5992,7 +5992,7 @@
         <w:t>2</w:t>
       </w:r>
       <w:r>
-        <w:t xml:space="preserve"> sobre todas as ordens de entrada dos preditores (GRÖMPING, 2006; LINDEMAN; MERENDA; GOLD, 1980)</w:t>
+        <w:t xml:space="preserve"> sobre todas as ordens de entrada dos preditores (Grömping, 2006; Lindeman; Merenda; Gold, 1980)</w:t>
       </w:r>
       <w:r>
         <w:t>. A decomposição é complementada por um modelo de árvores com gradiente (GBM), que aceita valores ausentes, com importância por permutação fora da amostra, por uma regressão logística para a nota igual ou superior a 4,9 e por coeficientes padronizados com erro padrão robusto HC3. Como verificação de sensibilidade, a decomposição é repetida com os tópicos diretos, com os anúncios de até 30 avaliações, com ao menos três aspectos observados e sem a satisfação geral entre os preditores e por segmento (tipo de a</w:t>
@@ -6007,7 +6007,7 @@
       </w:pPr>
       <w:r>
         <w:lastRenderedPageBreak/>
-        <w:t>A leitura por tópico compara o percentil da nota entre anúncios com e sem ao menos uma sentença negativa (ou positiva) no tópico, com controle do volume de avaliações e do número de sentenças. Os testes de tópicos usam a correção de Benjamini e Hochberg (BENJAMINI; HOCHBERG, 1995) para comparações múltiplas.</w:t>
+        <w:t>A leitura por tópico compara o percentil da nota entre anúncios com e sem ao menos uma sentença negativa (ou positiva) no tópico, com controle do volume de avaliações e do número de sentenças. Os testes de tópicos usam a correção de Benjamini e Hochberg (Benjamini; Hochberg, 1995) para comparações múltiplas.</w:t>
       </w:r>
     </w:p>
     <w:p>
@@ -6021,7 +6021,7 @@
         <w:t xml:space="preserve">zes, com a mesma semente e as mesmas dobras em todos os modelos </w:t>
       </w:r>
       <w:r>
-        <w:t>(PEDREGOSA et al., 2011).</w:t>
+        <w:t>(Pedregosa et al., 2011).</w:t>
       </w:r>
     </w:p>
     <w:p>
@@ -6045,7 +6045,7 @@
       <w:pPr>
         <w:pStyle w:val="Ttulo1"/>
       </w:pPr>
-      <w:bookmarkStart w:id="17" w:name="_Toc242737802"/>
+      <w:bookmarkStart w:id="17" w:name="_Toc242739021"/>
       <w:r>
         <w:lastRenderedPageBreak/>
         <w:t>4 VALIDAÇÃO DA MEDIÇÃO</w:t>
@@ -6067,7 +6067,7 @@
       <w:pPr>
         <w:pStyle w:val="Ttulo2"/>
       </w:pPr>
-      <w:bookmarkStart w:id="18" w:name="_Toc242737803"/>
+      <w:bookmarkStart w:id="18" w:name="_Toc242739022"/>
       <w:r>
         <w:t>4.1 EVIDÊNCIA DIRETA: FRASES ROTULADAS</w:t>
       </w:r>
@@ -6098,7 +6098,7 @@
         <w:keepNext/>
         <w:spacing w:before="120" w:after="80"/>
       </w:pPr>
-      <w:bookmarkStart w:id="19" w:name="_Toc242737827"/>
+      <w:bookmarkStart w:id="19" w:name="_Toc242739046"/>
       <w:r>
         <w:rPr>
           <w:b w:val="0"/>
@@ -6749,7 +6749,7 @@
         <w:keepNext/>
         <w:spacing w:before="120" w:after="80"/>
       </w:pPr>
-      <w:bookmarkStart w:id="20" w:name="_Toc242737828"/>
+      <w:bookmarkStart w:id="20" w:name="_Toc242739047"/>
       <w:r>
         <w:rPr>
           <w:b w:val="0"/>
@@ -7314,7 +7314,7 @@
       <w:pPr>
         <w:pStyle w:val="Ttulo2"/>
       </w:pPr>
-      <w:bookmarkStart w:id="21" w:name="_Toc242737804"/>
+      <w:bookmarkStart w:id="21" w:name="_Toc242739023"/>
       <w:r>
         <w:t>4.2 CONCORDÂNCIA ENTRE OS DOIS MODELOS</w:t>
       </w:r>
@@ -7339,7 +7339,7 @@
       <w:pPr>
         <w:pStyle w:val="Ttulo2"/>
       </w:pPr>
-      <w:bookmarkStart w:id="22" w:name="_Toc242737805"/>
+      <w:bookmarkStart w:id="22" w:name="_Toc242739024"/>
       <w:r>
         <w:t>4.3 REGRA DE ESCOLHA FIXADA DE ANTEMÃO E MODELO PRINCIPAL</w:t>
       </w:r>
@@ -7360,7 +7360,7 @@
       <w:pPr>
         <w:pStyle w:val="Ttulo2"/>
       </w:pPr>
-      <w:bookmarkStart w:id="23" w:name="_Toc242737806"/>
+      <w:bookmarkStart w:id="23" w:name="_Toc242739025"/>
       <w:r>
         <w:t>4.4 VALIDADE DE CONSTRUTO: CONCORDÂNCIA COM AS SUBNOTAS OFICIAIS</w:t>
       </w:r>
@@ -7380,7 +7380,7 @@
         <w:keepNext/>
         <w:spacing w:before="120" w:after="80"/>
       </w:pPr>
-      <w:bookmarkStart w:id="24" w:name="_Toc242737829"/>
+      <w:bookmarkStart w:id="24" w:name="_Toc242739048"/>
       <w:r>
         <w:rPr>
           <w:b w:val="0"/>
@@ -8530,7 +8530,7 @@
       <w:pPr>
         <w:pStyle w:val="Ttulo2"/>
       </w:pPr>
-      <w:bookmarkStart w:id="25" w:name="_Toc242737807"/>
+      <w:bookmarkStart w:id="25" w:name="_Toc242739026"/>
       <w:r>
         <w:t>4.5 CHECAGEM COM UM SEGUNDO MÉTODO DE TÓPICOS E COM UM SEGUNDO ANOTADOR</w:t>
       </w:r>
@@ -8553,7 +8553,7 @@
         <w:keepNext/>
         <w:spacing w:before="120" w:after="80"/>
       </w:pPr>
-      <w:bookmarkStart w:id="26" w:name="_Toc242737830"/>
+      <w:bookmarkStart w:id="26" w:name="_Toc242739049"/>
       <w:r>
         <w:rPr>
           <w:b w:val="0"/>
@@ -9333,7 +9333,7 @@
       <w:pPr>
         <w:pStyle w:val="Ttulo2"/>
       </w:pPr>
-      <w:bookmarkStart w:id="27" w:name="_Toc242737808"/>
+      <w:bookmarkStart w:id="27" w:name="_Toc242739027"/>
       <w:r>
         <w:t>4.6 CLASSIFICAÇÃO DOS ASPECTOS</w:t>
       </w:r>
@@ -9353,7 +9353,7 @@
         <w:keepNext/>
         <w:spacing w:before="120" w:after="80"/>
       </w:pPr>
-      <w:bookmarkStart w:id="28" w:name="_Toc242737831"/>
+      <w:bookmarkStart w:id="28" w:name="_Toc242739050"/>
       <w:r>
         <w:rPr>
           <w:b w:val="0"/>
@@ -10456,7 +10456,7 @@
       <w:pPr>
         <w:pStyle w:val="Ttulo1"/>
       </w:pPr>
-      <w:bookmarkStart w:id="29" w:name="_Toc242737809"/>
+      <w:bookmarkStart w:id="29" w:name="_Toc242739028"/>
       <w:r>
         <w:lastRenderedPageBreak/>
         <w:t>5 O QUE O TEXTO REVELA SOBRE A NOTA</w:t>
@@ -10475,7 +10475,7 @@
       <w:pPr>
         <w:pStyle w:val="Ttulo2"/>
       </w:pPr>
-      <w:bookmarkStart w:id="30" w:name="_Toc242737810"/>
+      <w:bookmarkStart w:id="30" w:name="_Toc242739029"/>
       <w:r>
         <w:t>5.1 IMPORTÂNCIA DOS ASPECTOS</w:t>
       </w:r>
@@ -10525,7 +10525,7 @@
         <w:keepNext/>
         <w:spacing w:before="120" w:after="80"/>
       </w:pPr>
-      <w:bookmarkStart w:id="31" w:name="_Toc242737832"/>
+      <w:bookmarkStart w:id="31" w:name="_Toc242739051"/>
       <w:r>
         <w:rPr>
           <w:b w:val="0"/>
@@ -11483,7 +11483,7 @@
         <w:keepNext/>
         <w:spacing w:before="120" w:after="80"/>
       </w:pPr>
-      <w:bookmarkStart w:id="32" w:name="_Toc242737833"/>
+      <w:bookmarkStart w:id="32" w:name="_Toc242739052"/>
       <w:r>
         <w:rPr>
           <w:b w:val="0"/>
@@ -12411,7 +12411,7 @@
       <w:pPr>
         <w:pStyle w:val="Ttulo2"/>
       </w:pPr>
-      <w:bookmarkStart w:id="33" w:name="_Toc242737811"/>
+      <w:bookmarkStart w:id="33" w:name="_Toc242739030"/>
       <w:r>
         <w:t>5.2 QUEIXAS E ELOGIOS POR TÓPICO</w:t>
       </w:r>
@@ -12443,7 +12443,7 @@
         <w:keepNext/>
         <w:spacing w:before="120" w:after="80"/>
       </w:pPr>
-      <w:bookmarkStart w:id="34" w:name="_Toc242737834"/>
+      <w:bookmarkStart w:id="34" w:name="_Toc242739053"/>
       <w:r>
         <w:rPr>
           <w:b w:val="0"/>
@@ -13602,7 +13602,7 @@
         <w:keepNext/>
         <w:spacing w:before="120" w:after="80"/>
       </w:pPr>
-      <w:bookmarkStart w:id="35" w:name="_Toc242737835"/>
+      <w:bookmarkStart w:id="35" w:name="_Toc242739054"/>
       <w:r>
         <w:rPr>
           <w:b w:val="0"/>
@@ -14281,7 +14281,7 @@
       <w:pPr>
         <w:pStyle w:val="Ttulo2"/>
       </w:pPr>
-      <w:bookmarkStart w:id="36" w:name="_Toc242737812"/>
+      <w:bookmarkStart w:id="36" w:name="_Toc242739031"/>
       <w:r>
         <w:lastRenderedPageBreak/>
         <w:t>5.3 CUIDADOS DE INTERPRETAÇÃO</w:t>
@@ -14300,7 +14300,7 @@
       <w:pPr>
         <w:pStyle w:val="Ttulo1"/>
       </w:pPr>
-      <w:bookmarkStart w:id="37" w:name="_Toc242737813"/>
+      <w:bookmarkStart w:id="37" w:name="_Toc242739032"/>
       <w:r>
         <w:lastRenderedPageBreak/>
         <w:t>6 APLICAÇÃO: DIAGNÓSTICO POR ANÚNCIO</w:t>
@@ -14352,7 +14352,7 @@
       <w:pPr>
         <w:pStyle w:val="Ttulo1"/>
       </w:pPr>
-      <w:bookmarkStart w:id="38" w:name="_Toc242737814"/>
+      <w:bookmarkStart w:id="38" w:name="_Toc242739033"/>
       <w:r>
         <w:lastRenderedPageBreak/>
         <w:t>7 UM ÍNDICE ÚNICO ACRESCENTA ALGO?</w:t>
@@ -14371,7 +14371,7 @@
       <w:pPr>
         <w:pStyle w:val="Ttulo2"/>
       </w:pPr>
-      <w:bookmarkStart w:id="39" w:name="_Toc242737815"/>
+      <w:bookmarkStart w:id="39" w:name="_Toc242739034"/>
       <w:r>
         <w:t>7.1 CONSTRUÇÃO DO ÍNDICE</w:t>
       </w:r>
@@ -14414,7 +14414,7 @@
         <w:t>m</w:t>
       </w:r>
       <w:r>
-        <w:t xml:space="preserve"> = 23 (a mediana de avaliações) (EFRON; MORRIS, 1975)</w:t>
+        <w:t xml:space="preserve"> = 23 (a mediana de avaliações) (Efron; Morris, 1975)</w:t>
       </w:r>
       <w:r>
         <w:t>. A razão é teórica. O encolhimento aproxima da média global os anúncios com poucas avaliações e, com isso, correlaciona o índice com o volume de avaliações justamente onde a nota é 5,0. Os anúncios de nota 5,0 têm mediana de 9 avaliações, contra 31 nos demais. Entre eles, a correlação de postos do índice com o logaritmo do volume é de 0,50 com encolhimento e de −0,04</w:t>
@@ -14427,7 +14427,7 @@
       <w:pPr>
         <w:pStyle w:val="Ttulo2"/>
       </w:pPr>
-      <w:bookmarkStart w:id="40" w:name="_Toc242737816"/>
+      <w:bookmarkStart w:id="40" w:name="_Toc242739035"/>
       <w:r>
         <w:t>7.2 COMPRESSÃO DA NOTA OFICIAL E REORDENAMENTO</w:t>
       </w:r>
@@ -14459,7 +14459,7 @@
         <w:keepNext/>
         <w:spacing w:before="120" w:after="80"/>
       </w:pPr>
-      <w:bookmarkStart w:id="41" w:name="_Toc242737836"/>
+      <w:bookmarkStart w:id="41" w:name="_Toc242739055"/>
       <w:r>
         <w:rPr>
           <w:b w:val="0"/>
@@ -14949,7 +14949,7 @@
       <w:pPr>
         <w:pStyle w:val="Ttulo2"/>
       </w:pPr>
-      <w:bookmarkStart w:id="42" w:name="_Toc242737817"/>
+      <w:bookmarkStart w:id="42" w:name="_Toc242739036"/>
       <w:r>
         <w:t>7.3 PODER EXPLICATIVO SOBRE OS ÍNDICES DE VOLUME</w:t>
       </w:r>
@@ -15002,7 +15002,7 @@
         <w:keepNext/>
         <w:spacing w:before="120" w:after="80"/>
       </w:pPr>
-      <w:bookmarkStart w:id="43" w:name="_Toc242737837"/>
+      <w:bookmarkStart w:id="43" w:name="_Toc242739056"/>
       <w:r>
         <w:rPr>
           <w:b w:val="0"/>
@@ -15948,7 +15948,7 @@
       <w:pPr>
         <w:pStyle w:val="Ttulo2"/>
       </w:pPr>
-      <w:bookmarkStart w:id="44" w:name="_Toc242737818"/>
+      <w:bookmarkStart w:id="44" w:name="_Toc242739037"/>
       <w:r>
         <w:t>7.4 MONOTONICIDADE E REORDENAMENTO</w:t>
       </w:r>
@@ -15968,7 +15968,7 @@
         <w:keepNext/>
         <w:spacing w:before="120" w:after="80"/>
       </w:pPr>
-      <w:bookmarkStart w:id="45" w:name="_Toc242737838"/>
+      <w:bookmarkStart w:id="45" w:name="_Toc242739057"/>
       <w:r>
         <w:rPr>
           <w:b w:val="0"/>
@@ -16777,7 +16777,7 @@
       <w:pPr>
         <w:pStyle w:val="Ttulo2"/>
       </w:pPr>
-      <w:bookmarkStart w:id="46" w:name="_Toc242737819"/>
+      <w:bookmarkStart w:id="46" w:name="_Toc242739038"/>
       <w:r>
         <w:t>7.5 SENSIBILIDADE</w:t>
       </w:r>
@@ -16825,7 +16825,7 @@
       <w:pPr>
         <w:pStyle w:val="Ttulo2"/>
       </w:pPr>
-      <w:bookmarkStart w:id="47" w:name="_Toc242737820"/>
+      <w:bookmarkStart w:id="47" w:name="_Toc242739039"/>
       <w:r>
         <w:t>7.6 COMO LER O RESULTADO</w:t>
       </w:r>
@@ -16846,7 +16846,7 @@
       <w:pPr>
         <w:pStyle w:val="Ttulo1"/>
       </w:pPr>
-      <w:bookmarkStart w:id="48" w:name="_Toc242737821"/>
+      <w:bookmarkStart w:id="48" w:name="_Toc242739040"/>
       <w:r>
         <w:lastRenderedPageBreak/>
         <w:t>8 DISCUSSÃO E LIMITAÇÕES</w:t>
@@ -16857,7 +16857,7 @@
       <w:pPr>
         <w:pStyle w:val="Ttulo2"/>
       </w:pPr>
-      <w:bookmarkStart w:id="49" w:name="_Toc242737822"/>
+      <w:bookmarkStart w:id="49" w:name="_Toc242739041"/>
       <w:r>
         <w:t>8.1 OS RESULTADOS À LUZ DA LITERATURA</w:t>
       </w:r>
@@ -16868,10 +16868,10 @@
         <w:pStyle w:val="Corpodotexto"/>
       </w:pPr>
       <w:r>
-        <w:t>Os dados reproduzem o padrão de compressão descrito para o Airbnb (ZERVAS; PROSERPIO; BYERS, 2021): 32,4% dos anúncios elegíveis têm nota exatamente igual a 5,0. A maior parte das sentenças é positiva em ambos os modelos de sentimento (78,9% em A e 81,5% em B). O resultado concorda com a observação de que as avaliações da plataforma adotam uma norma de comentário positivo (BRIDGES; VÁSQUEZ, 2018)</w:t>
-      </w:r>
-      <w:r>
-        <w:t xml:space="preserve"> e com a comparação, em cidades brasileiras e americanas, que encontra avaliações do Airbnb mais positivas que as de uma plataforma hoteleira (SANTOS et al., 2020). Dado esse viés, a decisão de trabalhar com a ordenação do sentimento e não com o seu nível e de tomar o percentil da nota como alvo, tem apoio nos próprios dados.</w:t>
+        <w:t>Os dados reproduzem o padrão de compressão descrito para o Airbnb (Zervas; Proserpio; Byers, 2021): 32,4% dos anúncios elegíveis têm nota exatamente igual a 5,0. A maior parte das sentenças é positiva em ambos os modelos de sentimento (78,9% em A e 81,5% em B). O resultado concorda com a observação de que as avaliações da plataforma adotam uma norma de comentário positivo (Bridges; Vásquez, 2018)</w:t>
+      </w:r>
+      <w:r>
+        <w:t xml:space="preserve"> e com a comparação, em cidades brasileiras e americanas, que encontra avaliações do Airbnb mais positivas que as de uma plataforma hoteleira (Santos et al., 2020). Dado esse viés, a decisão de trabalhar com a ordenação do sentimento e não com o seu nível e de tomar o percentil da nota como alvo, tem apoio nos próprios dados.</w:t>
       </w:r>
     </w:p>
     <w:p>
@@ -16899,21 +16899,21 @@
         <w:pStyle w:val="Corpodotexto"/>
       </w:pPr>
       <w:r>
-        <w:t>O resultado nulo do índice sintético tem relação com o efeito halo (THORNDIKE, 1920)</w:t>
-      </w:r>
-      <w:r>
-        <w:t xml:space="preserve">. Como as subnotas e a nota global são muito correlacionadas entre si, a nota oficial já captura boa parte do que o sentimento médio dos aspectos poderia acrescentar. O índice reordena os anúncios de nota 5,0 em relação à nota oficial, mas essa reordenação não se associa ao volume de avaliações além do que a nota oficial já explica. Os desfechos </w:t>
+        <w:t>O resultado nulo do índice sintético tem relação com o efeito halo (Thorndike, 1920)</w:t>
+      </w:r>
+      <w:r>
+        <w:t xml:space="preserve">. Como as subnotas e a nota global são muito correlacionadas entre si, a nota oficial já captura boa parte do que o sentimento médio dos aspectos poderia acrescentar. O índice reordena os anúncios de nota 5,0 em relação à nota oficial, mas essa reordenação não se associa ao volume de avaliações além do que a nota oficial já explica. Os desfechos disponíveis, que são </w:t>
       </w:r>
       <w:r>
         <w:lastRenderedPageBreak/>
-        <w:t>disponíveis, que são índices de volume, oferecem um teste pouco favorável ao índice. Essa é a primeira das duas leituras do resultado apresentadas na Seção 7.</w:t>
+        <w:t>índices de volume, oferecem um teste pouco favorável ao índice. Essa é a primeira das duas leituras do resultado apresentadas na Seção 7.</w:t>
       </w:r>
     </w:p>
     <w:p>
       <w:pPr>
         <w:pStyle w:val="Ttulo2"/>
       </w:pPr>
-      <w:bookmarkStart w:id="50" w:name="_Toc242737823"/>
+      <w:bookmarkStart w:id="50" w:name="_Toc242739042"/>
       <w:r>
         <w:t>8.2 IMPLICAÇÕES PARA ANFITRIÕES E EMPRESAS GESTORAS</w:t>
       </w:r>
@@ -16934,7 +16934,7 @@
       <w:pPr>
         <w:pStyle w:val="Ttulo2"/>
       </w:pPr>
-      <w:bookmarkStart w:id="51" w:name="_Toc242737824"/>
+      <w:bookmarkStart w:id="51" w:name="_Toc242739043"/>
       <w:r>
         <w:t>8.3 LIMITAÇÕES</w:t>
       </w:r>
@@ -17005,7 +17005,7 @@
       <w:pPr>
         <w:pStyle w:val="Ttulo1"/>
       </w:pPr>
-      <w:bookmarkStart w:id="52" w:name="_Toc242737825"/>
+      <w:bookmarkStart w:id="52" w:name="_Toc242739044"/>
       <w:r>
         <w:lastRenderedPageBreak/>
         <w:t>9 CONCLUSÕES</w:t>
@@ -17778,7 +17778,7 @@
         <w:t>Proceedings of the 2019 Conference on Empirical Methods in Natural Language Processing and the 9th International Joint Conference on Natural Language Processing (EMNLP-IJCNLP)</w:t>
       </w:r>
       <w:r>
-        <w:t>. [S. l.]: Association for Computational Linguistics, 2019. p. 3980-3990. DOI: 10.18653/v1/d19-1410.</w:t>
+        <w:t>. [S. l.]: Association for Computational Linguistics, 2019. p. 3982-3992. DOI: 10.18653/v1/d19-1410.</w:t>
       </w:r>
     </w:p>
     <w:p>
@@ -18260,31 +18260,31 @@
       </w:rPr>
     </w:lvl>
   </w:abstractNum>
-  <w:num w:numId="1" w16cid:durableId="377167678">
+  <w:num w:numId="1" w16cid:durableId="57677668">
     <w:abstractNumId w:val="8"/>
   </w:num>
-  <w:num w:numId="2" w16cid:durableId="691497102">
+  <w:num w:numId="2" w16cid:durableId="452745401">
     <w:abstractNumId w:val="6"/>
   </w:num>
-  <w:num w:numId="3" w16cid:durableId="1502888714">
+  <w:num w:numId="3" w16cid:durableId="418017830">
     <w:abstractNumId w:val="5"/>
   </w:num>
-  <w:num w:numId="4" w16cid:durableId="1760717238">
+  <w:num w:numId="4" w16cid:durableId="488526131">
     <w:abstractNumId w:val="4"/>
   </w:num>
-  <w:num w:numId="5" w16cid:durableId="1318726290">
+  <w:num w:numId="5" w16cid:durableId="587154465">
     <w:abstractNumId w:val="7"/>
   </w:num>
-  <w:num w:numId="6" w16cid:durableId="523789389">
+  <w:num w:numId="6" w16cid:durableId="937905839">
     <w:abstractNumId w:val="3"/>
   </w:num>
-  <w:num w:numId="7" w16cid:durableId="810906218">
+  <w:num w:numId="7" w16cid:durableId="1871410209">
     <w:abstractNumId w:val="2"/>
   </w:num>
-  <w:num w:numId="8" w16cid:durableId="858274763">
+  <w:num w:numId="8" w16cid:durableId="1790315904">
     <w:abstractNumId w:val="1"/>
   </w:num>
-  <w:num w:numId="9" w16cid:durableId="975793589">
+  <w:num w:numId="9" w16cid:durableId="181818273">
     <w:abstractNumId w:val="0"/>
   </w:num>
 </w:numbering>
@@ -29732,14 +29732,14 @@
     <w:next w:val="Normal"/>
     <w:uiPriority w:val="99"/>
     <w:unhideWhenUsed/>
-    <w:rsid w:val="00987116"/>
+    <w:rsid w:val="00F4431D"/>
   </w:style>
   <w:style w:type="character" w:styleId="Hyperlink">
     <w:name w:val="Hyperlink"/>
     <w:basedOn w:val="Fontepargpadro"/>
     <w:uiPriority w:val="99"/>
     <w:unhideWhenUsed/>
-    <w:rsid w:val="00987116"/>
+    <w:rsid w:val="00F4431D"/>
     <w:rPr>
       <w:color w:val="0000FF" w:themeColor="hyperlink"/>
       <w:u w:val="single"/>
@@ -29752,7 +29752,7 @@
     <w:autoRedefine/>
     <w:uiPriority w:val="39"/>
     <w:unhideWhenUsed/>
-    <w:rsid w:val="00987116"/>
+    <w:rsid w:val="00F4431D"/>
     <w:pPr>
       <w:spacing w:after="100"/>
     </w:pPr>
@@ -29764,7 +29764,7 @@
     <w:autoRedefine/>
     <w:uiPriority w:val="39"/>
     <w:unhideWhenUsed/>
-    <w:rsid w:val="00987116"/>
+    <w:rsid w:val="00F4431D"/>
     <w:pPr>
       <w:spacing w:after="100"/>
       <w:ind w:left="240"/>

</xml_diff>